<commit_message>
Update product prototype document
</commit_message>
<xml_diff>
--- a/docs/documents/02-产品原型设计.docx
+++ b/docs/documents/02-产品原型设计.docx
@@ -1795,14 +1795,6 @@
         <w:gridCol w:w="4156"/>
       </w:tblGrid>
       <w:tr>
-        <w:tblPrEx>
-          <w:tblCellMar>
-            <w:top w:w="0" w:type="dxa"/>
-            <w:left w:w="108" w:type="dxa"/>
-            <w:bottom w:w="0" w:type="dxa"/>
-            <w:right w:w="108" w:type="dxa"/>
-          </w:tblCellMar>
-        </w:tblPrEx>
         <w:trPr>
           <w:jc w:val="center"/>
         </w:trPr>
@@ -3210,7 +3202,7 @@
           <wp:inline distT="0" distB="0" distL="114300" distR="114300">
             <wp:extent cx="5273040" cy="3032125"/>
             <wp:effectExtent l="0" t="0" r="3810" b="6350"/>
-            <wp:docPr id="6" name="图片 6" descr="prototype-05-mine"/>
+            <wp:docPr id="8" name="图片 8" descr="prototype-05-mine"/>
             <wp:cNvGraphicFramePr>
               <a:graphicFrameLocks xmlns:a="http://schemas.openxmlformats.org/drawingml/2006/main" noChangeAspect="1"/>
             </wp:cNvGraphicFramePr>
@@ -3218,7 +3210,7 @@
               <a:graphicData uri="http://schemas.openxmlformats.org/drawingml/2006/picture">
                 <pic:pic xmlns:pic="http://schemas.openxmlformats.org/drawingml/2006/picture">
                   <pic:nvPicPr>
-                    <pic:cNvPr id="6" name="图片 6" descr="prototype-05-mine"/>
+                    <pic:cNvPr id="8" name="图片 8" descr="prototype-05-mine"/>
                     <pic:cNvPicPr>
                       <a:picLocks noChangeAspect="1"/>
                     </pic:cNvPicPr>
@@ -3244,6 +3236,8 @@
           </wp:inline>
         </w:drawing>
       </w:r>
+      <w:bookmarkStart w:id="0" w:name="_GoBack"/>
+      <w:bookmarkEnd w:id="0"/>
     </w:p>
     <w:p>
       <w:pPr>
@@ -3739,8 +3733,6 @@
           </wp:inline>
         </w:drawing>
       </w:r>
-      <w:bookmarkStart w:id="0" w:name="_GoBack"/>
-      <w:bookmarkEnd w:id="0"/>
     </w:p>
     <w:p>
       <w:pPr>

</xml_diff>